<commit_message>
Cambio de CFA con ajustes pendientes
</commit_message>
<xml_diff>
--- a/fuentes/621602_CF08_DU.docx
+++ b/fuentes/621602_CF08_DU.docx
@@ -2040,7 +2040,7 @@
                 <w:noProof/>
                 <w:webHidden/>
               </w:rPr>
-              <w:t>36</w:t>
+              <w:t>35</w:t>
             </w:r>
             <w:r>
               <w:rPr>
@@ -3713,6 +3713,12 @@
           <w:lang w:val="es-419" w:eastAsia="es-CO"/>
         </w:rPr>
         <w:t xml:space="preserve">Sistemas </w:t>
+      </w:r>
+      <w:r>
+        <w:rPr>
+          <w:lang w:val="es-419" w:eastAsia="es-CO"/>
+        </w:rPr>
+        <w:t xml:space="preserve">de </w:t>
       </w:r>
       <w:r>
         <w:rPr>
@@ -5652,13 +5658,7 @@
               <w:pStyle w:val="TextoTablas"/>
             </w:pPr>
             <w:r>
-              <w:t xml:space="preserve">Geomorfológicos </w:t>
-            </w:r>
-            <w:r>
-              <w:t>-</w:t>
-            </w:r>
-            <w:r>
-              <w:t xml:space="preserve"> Corrientes de agua</w:t>
+              <w:t>Geomorfológicos - Corrientes de agua</w:t>
             </w:r>
             <w:r>
               <w:t>.</w:t>
@@ -5814,13 +5814,7 @@
               <w:pStyle w:val="TextoTablas"/>
             </w:pPr>
             <w:r>
-              <w:t xml:space="preserve">Biogeográficos </w:t>
-            </w:r>
-            <w:r>
-              <w:t>-</w:t>
-            </w:r>
-            <w:r>
-              <w:t xml:space="preserve"> Agrupaciones vegetales</w:t>
+              <w:t>Biogeográficos - Agrupaciones vegetales</w:t>
             </w:r>
             <w:r>
               <w:t>.</w:t>
@@ -5870,13 +5864,7 @@
               <w:pStyle w:val="TextoTablas"/>
             </w:pPr>
             <w:r>
-              <w:t xml:space="preserve">Biogeográficos </w:t>
-            </w:r>
-            <w:r>
-              <w:t>-</w:t>
-            </w:r>
-            <w:r>
-              <w:t xml:space="preserve"> Agrupaciones animales</w:t>
+              <w:t>Biogeográficos - Agrupaciones animales</w:t>
             </w:r>
             <w:r>
               <w:t>.</w:t>
@@ -8179,86 +8167,29 @@
       </w:r>
       <w:r>
         <w:rPr>
-          <w:lang w:val="es-419" w:eastAsia="es-CO"/>
-        </w:rPr>
-        <w:t>.</w:t>
-      </w:r>
-      <w:r>
-        <w:rPr>
-          <w:lang w:val="es-419" w:eastAsia="es-CO"/>
-        </w:rPr>
-        <w:t xml:space="preserve"> Orientarse con las estrellas (hemisferio sur)</w:t>
-      </w:r>
-      <w:r>
-        <w:rPr>
-          <w:lang w:val="es-419" w:eastAsia="es-CO"/>
-        </w:rPr>
-        <w:t xml:space="preserve">. </w:t>
-      </w:r>
-      <w:r>
-        <w:rPr>
-          <w:lang w:val="es-419" w:eastAsia="es-CO"/>
-        </w:rPr>
-        <w:t>En el hemisferio sur se busca la “Cruz del Sur”, una constelación con forma de rombo o cometa. Si prolongamos la longitud de la cometa cuatro veces y media, el punto imaginario que localicemos indicará siempre el sur.</w:t>
-      </w:r>
-    </w:p>
-    <w:p>
-      <w:pPr>
-        <w:rPr>
-          <w:lang w:val="es-419" w:eastAsia="es-CO"/>
-        </w:rPr>
-      </w:pPr>
-      <w:r>
-        <w:rPr>
           <w:b/>
           <w:bCs/>
           <w:lang w:val="es-419" w:eastAsia="es-CO"/>
         </w:rPr>
-        <w:t>Orientación con la sombra de un palo</w:t>
-      </w:r>
-    </w:p>
-    <w:p>
-      <w:pPr>
-        <w:rPr>
-          <w:lang w:val="es-419" w:eastAsia="es-CO"/>
-        </w:rPr>
-      </w:pPr>
-      <w:r>
-        <w:rPr>
-          <w:lang w:val="es-419" w:eastAsia="es-CO"/>
-        </w:rPr>
-        <w:t xml:space="preserve">Este método solo funciona cuando hay sol. Se clava en un terreno abierto y llano un palo que proyecte una sombra de unos 30 o 40 cm. Luego de esto marcamos el extremo de la sombra. A continuación, con un cordón de un zapato, una rama u otro método improvisado, se traza una semicircunferencia usando como radio la longitud de la sombra. Ahora es necesario esperar el movimiento del Sol. La sombra se irá reduciendo a medida que nos acercamos a las 12:00 del día. Momento en que alcanzará su menor tamaño para después volver a crecer. En el punto en el que la sombra vuelva a alcanzar la semicircunferencia pondremos una marca. Al unir las dos </w:t>
-      </w:r>
-      <w:r>
-        <w:rPr>
-          <w:lang w:val="es-419" w:eastAsia="es-CO"/>
-        </w:rPr>
-        <w:lastRenderedPageBreak/>
-        <w:t>marcas s</w:t>
-      </w:r>
-      <w:r>
-        <w:rPr>
-          <w:lang w:val="es-419" w:eastAsia="es-CO"/>
-        </w:rPr>
-        <w:t>e</w:t>
-      </w:r>
-      <w:r>
-        <w:rPr>
-          <w:lang w:val="es-419" w:eastAsia="es-CO"/>
-        </w:rPr>
-        <w:t xml:space="preserve"> traza una línea occidente (primera marca) </w:t>
-      </w:r>
-      <w:r>
-        <w:rPr>
-          <w:lang w:val="es-419" w:eastAsia="es-CO"/>
-        </w:rPr>
-        <w:t>-</w:t>
-      </w:r>
-      <w:r>
-        <w:rPr>
-          <w:lang w:val="es-419" w:eastAsia="es-CO"/>
-        </w:rPr>
-        <w:t xml:space="preserve"> oriente (segunda marca). En la perpendicular se encontrarán el norte y el sur. Este método requiere tiempo y condiciones de luz solar adecuadas.</w:t>
+        <w:t xml:space="preserve"> (hemisferio sur)</w:t>
+      </w:r>
+      <w:r>
+        <w:rPr>
+          <w:lang w:val="es-419" w:eastAsia="es-CO"/>
+        </w:rPr>
+        <w:t>.</w:t>
+      </w:r>
+      <w:r>
+        <w:rPr>
+          <w:lang w:val="es-419" w:eastAsia="es-CO"/>
+        </w:rPr>
+        <w:t xml:space="preserve"> </w:t>
+      </w:r>
+      <w:r>
+        <w:rPr>
+          <w:lang w:val="es-419" w:eastAsia="es-CO"/>
+        </w:rPr>
+        <w:t>En el hemisferio sur se busca la “Cruz del Sur”, una constelación con forma de rombo o cometa. Si prolongamos la longitud de la cometa cuatro veces y media, el punto imaginario que localicemos indicará siempre el sur.</w:t>
       </w:r>
     </w:p>
     <w:p>
@@ -8273,7 +8204,7 @@
           <w:bCs/>
           <w:lang w:val="es-419" w:eastAsia="es-CO"/>
         </w:rPr>
-        <w:t>Orienta</w:t>
+        <w:t>Orientación con la sombra de un palo</w:t>
       </w:r>
       <w:r>
         <w:rPr>
@@ -8281,41 +8212,42 @@
           <w:bCs/>
           <w:lang w:val="es-419" w:eastAsia="es-CO"/>
         </w:rPr>
-        <w:t>ción</w:t>
-      </w:r>
+        <w:t xml:space="preserve">. </w:t>
+      </w:r>
+      <w:r>
+        <w:rPr>
+          <w:lang w:val="es-419" w:eastAsia="es-CO"/>
+        </w:rPr>
+        <w:t xml:space="preserve">Este método solo funciona cuando hay sol. Se clava en un terreno abierto y llano un palo que proyecte una sombra de unos 30 o 40 cm. Luego de esto marcamos el extremo de la sombra. A continuación, con un cordón de un zapato, una rama u otro método improvisado, se traza una semicircunferencia usando como radio la longitud de la sombra. Ahora es necesario esperar el movimiento del Sol. La sombra se irá reduciendo a medida que nos acercamos a las 12:00 del día. Momento en que alcanzará su menor tamaño para después volver a crecer. En el punto en el que la sombra vuelva a alcanzar la semicircunferencia pondremos una marca. Al unir las dos marcas se traza una línea </w:t>
+      </w:r>
+      <w:r>
+        <w:rPr>
+          <w:lang w:val="es-419" w:eastAsia="es-CO"/>
+        </w:rPr>
+        <w:lastRenderedPageBreak/>
+        <w:t>occidente (primera marca) – oriente (segunda marca). En la perpendicular se encontrarán el norte y el sur. Este método requiere tiempo y condiciones de luz solar adecuadas.</w:t>
+      </w:r>
+    </w:p>
+    <w:p>
+      <w:pPr>
+        <w:rPr>
+          <w:lang w:val="es-419" w:eastAsia="es-CO"/>
+        </w:rPr>
+      </w:pPr>
       <w:r>
         <w:rPr>
           <w:b/>
           <w:bCs/>
           <w:lang w:val="es-419" w:eastAsia="es-CO"/>
         </w:rPr>
-        <w:t xml:space="preserve"> con las estrellas (hemisferio norte)</w:t>
-      </w:r>
-      <w:r>
-        <w:rPr>
-          <w:lang w:val="es-419" w:eastAsia="es-CO"/>
-        </w:rPr>
-        <w:t>.</w:t>
-      </w:r>
-      <w:r>
-        <w:rPr>
-          <w:lang w:val="es-419" w:eastAsia="es-CO"/>
-        </w:rPr>
-        <w:t xml:space="preserve"> Orientarse con las estrellas (hemisferio norte)</w:t>
-      </w:r>
-      <w:r>
-        <w:rPr>
-          <w:lang w:val="es-419" w:eastAsia="es-CO"/>
-        </w:rPr>
-        <w:t>.</w:t>
-      </w:r>
-    </w:p>
-    <w:p>
-      <w:pPr>
-        <w:rPr>
-          <w:lang w:val="es-419" w:eastAsia="es-CO"/>
-        </w:rPr>
-      </w:pPr>
+        <w:t>Orientación con las estrellas (hemisferio norte)</w:t>
+      </w:r>
+      <w:r>
+        <w:rPr>
+          <w:lang w:val="es-419" w:eastAsia="es-CO"/>
+        </w:rPr>
+        <w:t xml:space="preserve">. </w:t>
+      </w:r>
       <w:r>
         <w:rPr>
           <w:lang w:val="es-419" w:eastAsia="es-CO"/>
@@ -8396,22 +8328,28 @@
       </w:pPr>
       <w:bookmarkStart w:id="19" w:name="_Toc235109772"/>
       <w:r>
+        <w:t>Puntos de referenciación en el destino</w:t>
+      </w:r>
+      <w:bookmarkEnd w:id="19"/>
+    </w:p>
+    <w:p>
+      <w:pPr>
+        <w:rPr>
+          <w:lang w:val="es-419" w:eastAsia="es-CO"/>
+        </w:rPr>
+      </w:pPr>
+      <w:r>
+        <w:rPr>
+          <w:lang w:val="es-419" w:eastAsia="es-CO"/>
+        </w:rPr>
+        <w:t xml:space="preserve">Los puntos de referencia son también un método válido para ubicarse. Para ilustrar esta forma de orientación, es útil remitirse imaginariamente a París (Francia). En </w:t>
+      </w:r>
+      <w:r>
+        <w:rPr>
+          <w:lang w:val="es-419" w:eastAsia="es-CO"/>
+        </w:rPr>
         <w:lastRenderedPageBreak/>
-        <w:t>Puntos de referenciación en el destino</w:t>
-      </w:r>
-      <w:bookmarkEnd w:id="19"/>
-    </w:p>
-    <w:p>
-      <w:pPr>
-        <w:rPr>
-          <w:lang w:val="es-419" w:eastAsia="es-CO"/>
-        </w:rPr>
-      </w:pPr>
-      <w:r>
-        <w:rPr>
-          <w:lang w:val="es-419" w:eastAsia="es-CO"/>
-        </w:rPr>
-        <w:t>Los puntos de referencia son también un método válido para ubicarse. Para ilustrar esta forma de orientación, es útil remitirse imaginariamente a París (Francia). En esta ciudad existen numerosos puntos de referencia, como edificios y monumentos. Entre los más reconocidos se encuentran la Torre Eiffel y el puente Bir Hakeim.</w:t>
+        <w:t>esta ciudad existen numerosos puntos de referencia, como edificios y monumentos. Entre los más reconocidos se encuentran la Torre Eiffel y el puente Bir Hakeim.</w:t>
       </w:r>
     </w:p>
     <w:p>
@@ -9908,7 +9846,7 @@
                 <w:sz w:val="28"/>
                 <w:szCs w:val="28"/>
               </w:rPr>
-              <w:t>Responsable Nacional Ecosistema de Recursos Educativos Digitales (RED) - Profesional 06</w:t>
+              <w:t>Profesional G06. Responsable Ecosistema Virtual de Recursos Educativos Digitales</w:t>
             </w:r>
           </w:p>
         </w:tc>

</xml_diff>